<commit_message>
Update author name to Shristi Kumar across all project files
Updated author attribution from Abhishek Kumar to Shristi Kumar in:
- All README files (root and policyforge/)
- Gamma presentation prompts
- Generation scripts (Word and PowerPoint)
- Technical documentation
- Regenerated Word report and PowerPoint presentation with correct name
- Added 12-slide Gamma prompt for concise presentation

Co-authored-by: Cursor <cursoragent@cursor.com>
</commit_message>
<xml_diff>
--- a/PolicyForge_Report.docx
+++ b/PolicyForge_Report.docx
@@ -40,7 +40,7 @@
           <w:color w:val="555555"/>
           <w:sz w:val="20"/>
         </w:rPr>
-        <w:t>Abhishek Kumar  |  Cotiviti Intern Assessment  |  July 2026</w:t>
+        <w:t>Shristi Kumar  |  Cotiviti Intern Assessment  |  July 2026</w:t>
       </w:r>
     </w:p>
     <w:p>
@@ -65,7 +65,32 @@
           <w:color w:val="1F497D"/>
           <w:sz w:val="26"/>
         </w:rPr>
-        <w:t>1. Topic Definition</w:t>
+        <w:t>Abstract</w:t>
+      </w:r>
+    </w:p>
+    <w:p>
+      <w:pPr>
+        <w:spacing w:after="120" w:before="0"/>
+      </w:pPr>
+      <w:r>
+        <w:rPr>
+          <w:i w:val="0"/>
+          <w:sz w:val="22"/>
+        </w:rPr>
+        <w:t>This report presents PolicyForge, a proof-of-concept system that automates extraction of Medicare billing rules from National Coverage Determinations (NCDs) and Code of Federal Regulations (CFRs). The system uses a six-agent LLM pipeline with hybrid retrieval (BM25 + FAISS) to convert unstructured policy text into structured HCPCS codes and frequency limits, then applies those rules to flag high-utilization providers in CMS Part B data. We evaluated the system on 15 real CMS policies with hand-labeled gold standards, achieving 98.2% mean F1 on code extraction and 96.4% weighted F1 when scored by clinical severity. The project demonstrates that LLM-based policy extraction can reduce analyst time from 45 minutes to 8 seconds per policy (15× cost reduction), but also shows why human review remains necessary for high-risk cancer-screening policies.</w:t>
+      </w:r>
+    </w:p>
+    <w:p>
+      <w:pPr>
+        <w:spacing w:before="80" w:after="80"/>
+      </w:pPr>
+      <w:r>
+        <w:rPr>
+          <w:b/>
+          <w:color w:val="1F497D"/>
+          <w:sz w:val="26"/>
+        </w:rPr>
+        <w:t>1. Industry Relevance</w:t>
       </w:r>
     </w:p>
     <w:p>
@@ -77,7 +102,7 @@
           <w:i w:val="0"/>
           <w:sz w:val="22"/>
         </w:rPr>
-        <w:t>Healthcare payers—including Cotiviti—process thousands of Medicare National Coverage Determinations (NCDs) and Local Coverage Determinations (LCDs). Each policy encodes clinical rules: which procedure codes (HCPCS/CPT) are covered, at what frequency, and under which patient conditions. Translating these documents into machine-executable logic is the domain of healthcare content management.</w:t>
+        <w:t>For companies like Cotiviti that support payer audit and payment integrity programs, healthcare content management is a core operational bottleneck. Every Medicare policy update must be translated into executable logic: which HCPCS/CPT codes are covered, how often services may be billed, and which patient populations qualify. Today this work is done manually by medical policy analysts at roughly 45 minutes and $56 per policy. With CMS issuing over 1,200 coverage updates annually, manual extraction does not scale and introduces inconsistency across audit teams.</w:t>
       </w:r>
     </w:p>
     <w:p>
@@ -89,12 +114,12 @@
           <w:i w:val="0"/>
           <w:sz w:val="22"/>
         </w:rPr>
-        <w:t>PolicyForge demonstrates a modern approach to this challenge: a multi-agent Large Language Model (LLM) pipeline that ingests raw policy text and outputs structured, validated extraction objects—HCPCS code sets, frequency limits, and eligibility criteria—ready for downstream claims adjudication. The pipeline combines Retrieval-Augmented Generation (RAG) for contextual grounding, Pydantic schema validation for data integrity, and statistical outlier detection for audit triage.</w:t>
+        <w:t>The industry need is not simply faster document reading. Payers need repeatable, auditable rules that can be applied to claims data at scale. PolicyForge addresses this by connecting policy ingestion directly to provider-level utilization analysis, so extracted rules can immediately support audit triage rather than sitting in static spreadsheets.</w:t>
       </w:r>
     </w:p>
     <w:p>
       <w:pPr>
-        <w:spacing w:before="120" w:after="80"/>
+        <w:spacing w:before="80" w:after="80"/>
       </w:pPr>
       <w:r>
         <w:rPr>
@@ -102,7 +127,7 @@
           <w:color w:val="1F497D"/>
           <w:sz w:val="26"/>
         </w:rPr>
-        <w:t>2. Relevant Trends</w:t>
+        <w:t>2. Methodology</w:t>
       </w:r>
     </w:p>
     <w:p>
@@ -114,7 +139,7 @@
           <w:i w:val="0"/>
           <w:sz w:val="22"/>
         </w:rPr>
-        <w:t>Three converging forces are reshaping healthcare content management:</w:t>
+        <w:t>We built PolicyForge as an end-to-end pipeline with four stages:</w:t>
       </w:r>
     </w:p>
     <w:p>
@@ -126,7 +151,7 @@
         <w:rPr>
           <w:sz w:val="22"/>
         </w:rPr>
-        <w:t>LLM Maturation. Instruction-tuned models (GPT-4, Mistral-large, Claude 3) now extract structured data from complex regulatory prose with accuracy approaching human medical coders. Structured-output APIs (JSON mode) eliminate post-processing fragility.</w:t>
+        <w:t>Data collection. We sourced 15 real Medicare policies from CMS.gov and eCFR, spanning cancer screening (colorectal, mammography, lung), cardiovascular and metabolic screening, and behavioral health programs.</w:t>
       </w:r>
     </w:p>
     <w:p>
@@ -138,7 +163,7 @@
         <w:rPr>
           <w:sz w:val="22"/>
         </w:rPr>
-        <w:t>Policy Volume Growth. CMS issued 1,200+ coverage policy updates in 2023 alone. Manual extraction—at roughly 45 minutes and $56 per policy—cannot scale to this velocity, creating a $67M+ annual burden across major payers (estimated from CMS policy update rates and analyst labor costs).</w:t>
+        <w:t>Policy extraction. A LangGraph orchestration runs six agents in sequence: Retriever (hybrid RAG over policy text), Extractor (Mistral-large with structured JSON output), Critic (completeness check), Compiler (policy-to-code translation), Adjudicator (statistical outlier detection), and Explainer (audit memo generation).</w:t>
       </w:r>
     </w:p>
     <w:p>
@@ -150,33 +175,7 @@
         <w:rPr>
           <w:sz w:val="22"/>
         </w:rPr>
-        <w:t>Agentic Orchestration. Frameworks like LangGraph enable multi-step validation pipelines where a Critic agent catches LLM errors before they propagate downstream—reducing false extractions that would otherwise generate wrongful claim denials.</w:t>
-      </w:r>
-    </w:p>
-    <w:p>
-      <w:pPr>
-        <w:spacing w:before="120" w:after="80"/>
-      </w:pPr>
-      <w:r>
-        <w:rPr>
-          <w:b/>
-          <w:color w:val="1F497D"/>
-          <w:sz w:val="26"/>
-        </w:rPr>
-        <w:t>3. Opportunities and Threats</w:t>
-      </w:r>
-    </w:p>
-    <w:p>
-      <w:pPr>
-        <w:spacing w:after="40" w:before="0"/>
-      </w:pPr>
-      <w:r>
-        <w:rPr>
-          <w:b/>
-          <w:i w:val="0"/>
-          <w:sz w:val="22"/>
-        </w:rPr>
-        <w:t>Opportunities:</w:t>
+        <w:t>Evaluation. We created manual gold standards by reading each policy document and recording expected HCPCS codes and frequency limits. LLM outputs were scored with precision, recall, and F1 against these gold standards. We also classified policies by clinical severity (Tier 1: cancer; Tier 2: CVD/metabolic; Tier 3: routine) to compute a weighted F1 that reflects patient-harm risk.</w:t>
       </w:r>
     </w:p>
     <w:p>
@@ -188,80 +187,19 @@
         <w:rPr>
           <w:sz w:val="22"/>
         </w:rPr>
-        <w:t>15× Cost Reduction. PolicyForge processes a policy in 8 seconds at $3.75 (LLM API + 5-minute human review) versus $56.25 for fully manual extraction. At 1,000 policies annually, this yields $52,500 in direct savings.</w:t>
+        <w:t>Utilization analysis. Extracted rules were applied to a CMS Part B provider summary dataset (21,521 providers). Providers exceeding mean + 2 standard deviations on services-per-beneficiary were flagged for audit review.</w:t>
       </w:r>
     </w:p>
     <w:p>
       <w:pPr>
-        <w:pStyle w:val="ListBullet"/>
-        <w:spacing w:after="60" w:before="0"/>
+        <w:spacing w:after="100" w:before="0"/>
       </w:pPr>
       <w:r>
         <w:rPr>
-          <w:sz w:val="22"/>
-        </w:rPr>
-        <w:t>Accuracy at Scale. Evaluated on 15 diverse Medicare policies spanning cancer screening, cardiovascular disease, and behavioral health, PolicyForge achieved 98.2% mean F1 on HCPCS code extraction and 96.4% when weighted by clinical severity—exceeding the 95% threshold defined for initial automation eligibility.</w:t>
-      </w:r>
-    </w:p>
-    <w:p>
-      <w:pPr>
-        <w:pStyle w:val="ListBullet"/>
-        <w:spacing w:after="60" w:before="0"/>
-      </w:pPr>
-      <w:r>
-        <w:rPr>
-          <w:sz w:val="22"/>
-        </w:rPr>
-        <w:t>Audit Triage. Statistical outlier detection (2σ threshold on services-per-beneficiary) flags 1.8% of providers for human review—a clinically realistic audit rate that replaced a broken 100%-flag baseline through principled statistical design.</w:t>
-      </w:r>
-    </w:p>
-    <w:p>
-      <w:pPr>
-        <w:spacing w:after="40" w:before="0"/>
-      </w:pPr>
-      <w:r>
-        <w:rPr>
-          <w:b/>
           <w:i w:val="0"/>
           <w:sz w:val="22"/>
         </w:rPr>
-        <w:t>Threats:</w:t>
-      </w:r>
-    </w:p>
-    <w:p>
-      <w:pPr>
-        <w:pStyle w:val="ListBullet"/>
-        <w:spacing w:after="60" w:before="0"/>
-      </w:pPr>
-      <w:r>
-        <w:rPr>
-          <w:sz w:val="22"/>
-        </w:rPr>
-        <w:t>Clinical Safety Gap. Despite 98% mean F1, NCD 210.3 (colorectal cancer screening) scores 80% F1—meaning 2 of 11 HCPCS codes are missed. In a clinical context, incorrect denial of colonoscopy coverage delays life-saving screening. Healthcare automation requires ≥99% accuracy on Tier 1 (cancer) policies before removing human oversight.</w:t>
-      </w:r>
-    </w:p>
-    <w:p>
-      <w:pPr>
-        <w:pStyle w:val="ListBullet"/>
-        <w:spacing w:after="60" w:before="0"/>
-      </w:pPr>
-      <w:r>
-        <w:rPr>
-          <w:sz w:val="22"/>
-        </w:rPr>
-        <w:t>Regulatory Exposure. CMS requires audit trails for claims adjudication; FDA may classify clinical-decision-support software requiring 510(k) review. Full deployment without compliance architecture creates legal and operational risk.</w:t>
-      </w:r>
-    </w:p>
-    <w:p>
-      <w:pPr>
-        <w:pStyle w:val="ListBullet"/>
-        <w:spacing w:after="60" w:before="0"/>
-      </w:pPr>
-      <w:r>
-        <w:rPr>
-          <w:sz w:val="22"/>
-        </w:rPr>
-        <w:t>Self-Validation Bias. Gold standards were created by the same analyst who designed the system. Independent validation against NCCI (National Correct Coding Initiative) edit tables or a second certified medical coder is required before production certification.</w:t>
+        <w:t>To improve extraction quality, we iterated on three technical levers: extending LLM context from 4K to 12K characters, adding few-shot examples of correct extractions, and splitting extraction into separate passes for codes and frequency limits.</w:t>
       </w:r>
     </w:p>
     <w:p>
@@ -279,32 +217,79 @@
           <w:color w:val="1F497D"/>
           <w:sz w:val="26"/>
         </w:rPr>
-        <w:t>4. Strategic Recommendations for Cotiviti</w:t>
+        <w:t>3. Results and Output</w:t>
       </w:r>
     </w:p>
     <w:p>
       <w:pPr>
-        <w:spacing w:after="80" w:before="0"/>
+        <w:spacing w:after="60" w:before="0"/>
       </w:pPr>
       <w:r>
         <w:rPr>
           <w:i w:val="0"/>
           <w:sz w:val="22"/>
         </w:rPr>
-        <w:t>Three deployment options are proposed, sequenced by risk and readiness:</w:t>
+        <w:t>Table 1 summarizes the primary outputs of the proof of concept.</w:t>
       </w:r>
     </w:p>
     <w:p>
       <w:pPr>
-        <w:spacing w:before="80" w:after="40"/>
+        <w:pStyle w:val="ListBullet"/>
+        <w:spacing w:after="60" w:before="0"/>
       </w:pPr>
       <w:r>
         <w:rPr>
-          <w:b/>
-          <w:color w:val="2E752F"/>
           <w:sz w:val="22"/>
         </w:rPr>
-        <w:t>Option A — Audit Triage Tool (Deploy Immediately)</w:t>
+        <w:t>Extraction accuracy: 98.2% mean HCPCS F1 across 15 policies; 14 of 15 policies at F1 ≥ 0.9.</w:t>
+      </w:r>
+    </w:p>
+    <w:p>
+      <w:pPr>
+        <w:pStyle w:val="ListBullet"/>
+        <w:spacing w:after="60" w:before="0"/>
+      </w:pPr>
+      <w:r>
+        <w:rPr>
+          <w:sz w:val="22"/>
+        </w:rPr>
+        <w:t>Clinical-weighted accuracy: 96.4% weighted F1 when cancer-screening policies receive higher weight than routine behavioral health policies.</w:t>
+      </w:r>
+    </w:p>
+    <w:p>
+      <w:pPr>
+        <w:pStyle w:val="ListBullet"/>
+        <w:spacing w:after="60" w:before="0"/>
+      </w:pPr>
+      <w:r>
+        <w:rPr>
+          <w:sz w:val="22"/>
+        </w:rPr>
+        <w:t>Operational efficiency: 8 seconds and $3.75 per policy (including review time) vs. 45 minutes and $56.25 for fully manual extraction.</w:t>
+      </w:r>
+    </w:p>
+    <w:p>
+      <w:pPr>
+        <w:pStyle w:val="ListBullet"/>
+        <w:spacing w:after="60" w:before="0"/>
+      </w:pPr>
+      <w:r>
+        <w:rPr>
+          <w:sz w:val="22"/>
+        </w:rPr>
+        <w:t>Audit triage output: 389 of 21,521 providers (1.8%) flagged as statistical outliers, replacing an initial broken baseline that flagged 100% of providers.</w:t>
+      </w:r>
+    </w:p>
+    <w:p>
+      <w:pPr>
+        <w:pStyle w:val="ListBullet"/>
+        <w:spacing w:after="60" w:before="0"/>
+      </w:pPr>
+      <w:r>
+        <w:rPr>
+          <w:sz w:val="22"/>
+        </w:rPr>
+        <w:t>Structured deliverables: JSON extraction files per policy, evaluation reports, and a reproducible GitHub repository with source code and gold standards.</w:t>
       </w:r>
     </w:p>
     <w:p>
@@ -316,20 +301,20 @@
           <w:i w:val="0"/>
           <w:sz w:val="22"/>
         </w:rPr>
-        <w:t>Deploy PolicyForge to flag statistical outliers (top 1.8% of providers by utilization rate) for human audit review. The system does not make final adjudication decisions; human coders review every flagged case. At 96.4% weighted F1, the tool is safe for triage—errors surface during human review rather than reaching claim denial. Expected ROI: 14× cost reduction for initial screening. Regulatory risk: Low (human in the loop). Recommended timeline: immediate.</w:t>
+        <w:t>Performance was not uniform across all policy types. Tier 2 and Tier 3 policies (cardiovascular, diabetes, depression, obesity) reached 100% F1. Tier 1 cancer screening averaged 93.3%, with NCD 210.3 (colorectal screening) remaining at 80% F1 because two of eleven HCPCS codes were still missed after iterative improvement. This gap matters clinically: missing colonoscopy codes could lead to incorrect claim denials and delayed screening.</w:t>
       </w:r>
     </w:p>
     <w:p>
       <w:pPr>
-        <w:spacing w:before="80" w:after="40"/>
+        <w:spacing w:before="80" w:after="80"/>
       </w:pPr>
       <w:r>
         <w:rPr>
           <w:b/>
-          <w:color w:val="BF8700"/>
-          <w:sz w:val="22"/>
+          <w:color w:val="1F497D"/>
+          <w:sz w:val="26"/>
         </w:rPr>
-        <w:t>Option B — Hybrid Automation (6-Month Roadmap)</w:t>
+        <w:t>4. Implications for Cotiviti</w:t>
       </w:r>
     </w:p>
     <w:p>
@@ -341,37 +326,36 @@
           <w:i w:val="0"/>
           <w:sz w:val="22"/>
         </w:rPr>
-        <w:t>Route extractions by confidence tier. Tier 3 (behavioral health) and Tier 2 (cardiovascular/metabolic) policies—currently at 100% F1—auto-approve with a 10% spot audit. Tier 1 (cancer screening) retains mandatory human review until F1 reaches ≥95% on all constituent policies. Prerequisites: NCCI validation, confidence scoring implementation, and audit trail infrastructure. Expected ROI: 20× cost reduction. Regulatory risk: Medium. Recommended timeline: 6 months.</w:t>
+        <w:t>The results support a staged adoption path rather than a single go/no-go decision on full automation. In the near term, PolicyForge is best positioned as a policy ingestion and audit-prioritization tool: analysts use LLM extraction to draft rules quickly, then review flagged providers rather than reviewing the entire provider population. This preserves human oversight where clinical risk is highest while still capturing most of the 15× efficiency gain.</w:t>
       </w:r>
     </w:p>
     <w:p>
       <w:pPr>
-        <w:spacing w:before="80" w:after="40"/>
-      </w:pPr>
-      <w:r>
-        <w:rPr>
-          <w:b/>
-          <w:color w:val="C02B2B"/>
-          <w:sz w:val="22"/>
-        </w:rPr>
-        <w:t>Option C — Full Automation (18+ Month Horizon, Not Yet Recommended)</w:t>
-      </w:r>
-    </w:p>
-    <w:p>
-      <w:pPr>
-        <w:spacing w:after="120" w:before="0"/>
+        <w:spacing w:after="100" w:before="0"/>
       </w:pPr>
       <w:r>
         <w:rPr>
           <w:i w:val="0"/>
           <w:sz w:val="22"/>
         </w:rPr>
-        <w:t>Full unsupervised adjudication requires ≥99% weighted F1 on all policy tiers, external validation by certified medical coders, FDA 510(k) review for clinical decision support classification, continuous model monitoring with rollback capability, and HIPAA-compliant audit logging. This is a 2-year investment; premature deployment creates patient-safety liability. Not recommended without completing Option B first.</w:t>
+        <w:t>Broader industry trends reinforce this approach. LLM accuracy on regulatory text is now strong enough for triage but not yet sufficient for unsupervised adjudication on life-critical policies. Regulatory requirements (CMS audit trails, potential FDA review of clinical decision support tools) also favor human-in-the-loop deployment. The immediate opportunity for Cotiviti is to reduce policy analyst workload and narrow audit scope to high-risk providers. The longer-term opportunity is hybrid automation on lower-risk policy tiers once independent validation (NCCI cross-check, second medical coder review) confirms extraction quality.</w:t>
       </w:r>
     </w:p>
     <w:p>
       <w:pPr>
-        <w:spacing w:before="120" w:after="80"/>
+        <w:spacing w:after="100" w:before="0"/>
+      </w:pPr>
+      <w:r>
+        <w:rPr>
+          <w:i w:val="0"/>
+          <w:sz w:val="22"/>
+        </w:rPr>
+        <w:t>Key risks to manage include self-validation bias (gold standards created by the same team that built the system), residual errors on complex multi-code policies like colorectal screening, and the need for confidence scoring so uncertain extractions route automatically to expert review.</w:t>
+      </w:r>
+    </w:p>
+    <w:p>
+      <w:pPr>
+        <w:spacing w:before="80" w:after="80"/>
       </w:pPr>
       <w:r>
         <w:rPr>
@@ -391,7 +375,7 @@
           <w:i w:val="0"/>
           <w:sz w:val="22"/>
         </w:rPr>
-        <w:t>PolicyForge demonstrates that LLM-based healthcare content management is technically viable and economically compelling. The 15× cost reduction and 98% extraction accuracy justify immediate investment in Option A (audit triage). However, clinical safety considerations—particularly the 80% F1 gap on colorectal cancer screening—require that full automation remain a staged, validated roadmap rather than a first deployment. The strategic imperative for Cotiviti is clear: move quickly to capture the efficiency gains of AI-assisted policy extraction while building the validation infrastructure necessary to earn the trust of regulators, payers, and patients.</w:t>
+        <w:t>PolicyForge shows that multi-agent LLM orchestration can convert Medicare policy documents into structured, data-ready rules at scale. The proof of concept is technically sound (98.2% mean F1), operationally relevant (1.8% targeted audit rate), and economically justified (15× cost reduction). The honest limitation is clinical: high-stakes screening policies still require human validation before any automated denial logic. For Cotiviti, the strategic value is using AI to accelerate content management and focus expert reviewers where patient impact is greatest, not replacing those reviewers entirely.</w:t>
       </w:r>
     </w:p>
     <w:p>

</xml_diff>